<commit_message>
docs: agrega la URL del repositorio al README y al informe
</commit_message>
<xml_diff>
--- a/docs/Informe_EV_U3.docx
+++ b/docs/Informe_EV_U3.docx
@@ -513,7 +513,7 @@
           <w:sz w:val="24"/>
           <w:szCs w:val="24"/>
         </w:rPr>
-        <w:t xml:space="preserve">____________________________________________</w:t>
+        <w:t xml:space="preserve">https://github.com/Steeein/Eva_U3_Desarrollo_Web</w:t>
       </w:r>
     </w:p>
     <w:p>
@@ -5291,7 +5291,7 @@
           <w:sz w:val="24"/>
           <w:szCs w:val="24"/>
         </w:rPr>
-        <w:t xml:space="preserve">____________________________________________</w:t>
+        <w:t xml:space="preserve">https://github.com/Steeein/Eva_U3_Desarrollo_Web</w:t>
       </w:r>
     </w:p>
     <w:p>
@@ -5326,7 +5326,7 @@
           <w:sz w:val="18"/>
           <w:szCs w:val="18"/>
         </w:rPr>
-        <w:t xml:space="preserve">git clone &lt;URL-DEL-REPOSITORIO&gt;</w:t>
+        <w:t xml:space="preserve">git clone https://github.com/Steeein/Eva_U3_Desarrollo_Web.git</w:t>
       </w:r>
       <w:r>
         <w:br/>
@@ -5337,7 +5337,7 @@
           <w:sz w:val="18"/>
           <w:szCs w:val="18"/>
         </w:rPr>
-        <w:t xml:space="preserve">cd EV_U3_ABAROA_DIEGO</w:t>
+        <w:t xml:space="preserve">cd Eva_U3_Desarrollo_Web</w:t>
       </w:r>
       <w:r>
         <w:br/>

</xml_diff>

<commit_message>
docs: actualiza la URL del repositorio en el README y el informe
</commit_message>
<xml_diff>
--- a/docs/Informe_EV_U3.docx
+++ b/docs/Informe_EV_U3.docx
@@ -513,7 +513,7 @@
           <w:sz w:val="24"/>
           <w:szCs w:val="24"/>
         </w:rPr>
-        <w:t xml:space="preserve">https://github.com/Steeein/Eva_U3_Desarrollo_Web</w:t>
+        <w:t xml:space="preserve">https://github.com/Steeein/EV_U3_ABAROA_DIEGO</w:t>
       </w:r>
     </w:p>
     <w:p>
@@ -5291,7 +5291,7 @@
           <w:sz w:val="24"/>
           <w:szCs w:val="24"/>
         </w:rPr>
-        <w:t xml:space="preserve">https://github.com/Steeein/Eva_U3_Desarrollo_Web</w:t>
+        <w:t xml:space="preserve">https://github.com/Steeein/EV_U3_ABAROA_DIEGO</w:t>
       </w:r>
     </w:p>
     <w:p>
@@ -5326,7 +5326,7 @@
           <w:sz w:val="18"/>
           <w:szCs w:val="18"/>
         </w:rPr>
-        <w:t xml:space="preserve">git clone https://github.com/Steeein/Eva_U3_Desarrollo_Web.git</w:t>
+        <w:t xml:space="preserve">git clone https://github.com/Steeein/EV_U3_ABAROA_DIEGO.git</w:t>
       </w:r>
       <w:r>
         <w:br/>
@@ -5337,7 +5337,7 @@
           <w:sz w:val="18"/>
           <w:szCs w:val="18"/>
         </w:rPr>
-        <w:t xml:space="preserve">cd Eva_U3_Desarrollo_Web</w:t>
+        <w:t xml:space="preserve">cd EV_U3_ABAROA_DIEGO</w:t>
       </w:r>
       <w:r>
         <w:br/>

</xml_diff>

<commit_message>
docs: completa los datos de identificacion del informe y el README
</commit_message>
<xml_diff>
--- a/docs/Informe_EV_U3.docx
+++ b/docs/Informe_EV_U3.docx
@@ -365,7 +365,7 @@
                 <w:sz w:val="20"/>
                 <w:szCs w:val="20"/>
               </w:rPr>
-              <w:t xml:space="preserve">____________________________</w:t>
+              <w:t xml:space="preserve">Victor Israel Cofre Farias</w:t>
             </w:r>
           </w:p>
         </w:tc>
@@ -417,7 +417,7 @@
                 <w:sz w:val="20"/>
                 <w:szCs w:val="20"/>
               </w:rPr>
-              <w:t xml:space="preserve">____ / ____ / 2026</w:t>
+              <w:t xml:space="preserve">02 de septiembre de 2026</w:t>
             </w:r>
           </w:p>
         </w:tc>

</xml_diff>

<commit_message>
docs: agrega el anexo con las transcripciones HTTP reales de las pruebas
</commit_message>
<xml_diff>
--- a/docs/Informe_EV_U3.docx
+++ b/docs/Informe_EV_U3.docx
@@ -5120,7 +5120,7 @@
           <w:sz w:val="24"/>
           <w:szCs w:val="24"/>
         </w:rPr>
-        <w:t xml:space="preserve">Nota: se recomienda adjuntar en este apartado las capturas de pantalla obtenidas desde Postman para cada uno de los códigos de respuesta.</w:t>
+        <w:t xml:space="preserve">En el Anexo A se reproduce la transcripción literal de cada petición y su respuesta HTTP, incluida la línea de estado devuelta por el servidor.</w:t>
       </w:r>
     </w:p>
     <w:p>
@@ -5463,6 +5463,1446 @@
           <w:szCs w:val="24"/>
         </w:rPr>
         <w:t xml:space="preserve">El desarrollo permitió aplicar de forma práctica los conceptos revisados en la unidad: el protocolo HTTP y su arquitectura cliente-servidor, los métodos POST, GET, PUT, PATCH y DELETE, los códigos de estado 200, 201, 204, 404 y 422, la construcción de una API REST en Laravel, el uso de validaciones y los filtros de búsqueda dinámicos con Eloquent. Adicionalmente se integró autenticación mediante JWT, reforzando la seguridad de los endpoints expuestos.</w:t>
+      </w:r>
+    </w:p>
+    <w:p>
+      <w:r>
+        <w:br w:type="page"/>
+      </w:r>
+    </w:p>
+    <w:p>
+      <w:pPr>
+        <w:pStyle w:val="Heading1"/>
+        <w:spacing w:after="160" w:before="320" w:line="276"/>
+      </w:pPr>
+      <w:r>
+        <w:rPr>
+          <w:rFonts w:ascii="Arial" w:cs="Arial" w:eastAsia="Arial" w:hAnsi="Arial"/>
+          <w:b/>
+          <w:bCs/>
+          <w:color w:val="16324F"/>
+          <w:sz w:val="28"/>
+          <w:szCs w:val="28"/>
+        </w:rPr>
+        <w:t xml:space="preserve">Anexo A - Transcripcion de las pruebas</w:t>
+      </w:r>
+    </w:p>
+    <w:p>
+      <w:pPr>
+        <w:spacing w:after="120" w:line="276"/>
+        <w:jc w:val="both"/>
+      </w:pPr>
+      <w:r>
+        <w:rPr>
+          <w:rFonts w:ascii="Arial" w:cs="Arial" w:eastAsia="Arial" w:hAnsi="Arial"/>
+          <w:sz w:val="24"/>
+          <w:szCs w:val="24"/>
+        </w:rPr>
+        <w:t xml:space="preserve">Se reproduce a continuacion la salida literal obtenida al ejecutar cada peticion contra el servidor mediante cURL. La primera linea de cada respuesta corresponde a la linea de estado HTTP devuelta por la aplicacion.</w:t>
+      </w:r>
+    </w:p>
+    <w:p>
+      <w:pPr>
+        <w:pStyle w:val="Heading2"/>
+        <w:spacing w:after="120" w:before="240" w:line="276"/>
+      </w:pPr>
+      <w:r>
+        <w:rPr>
+          <w:rFonts w:ascii="Arial" w:cs="Arial" w:eastAsia="Arial" w:hAnsi="Arial"/>
+          <w:b/>
+          <w:bCs/>
+          <w:color w:val="1B2733"/>
+          <w:sz w:val="24"/>
+          <w:szCs w:val="24"/>
+        </w:rPr>
+        <w:t xml:space="preserve">INDICADOR 1 - Crear proyecto (201 Created)</w:t>
+      </w:r>
+    </w:p>
+    <w:p>
+      <w:pPr>
+        <w:pBdr>
+          <w:top w:val="single" w:color="DDE3EC" w:sz="4"/>
+          <w:bottom w:val="single" w:color="DDE3EC" w:sz="4"/>
+          <w:left w:val="single" w:color="DDE3EC" w:sz="4"/>
+          <w:right w:val="single" w:color="DDE3EC" w:sz="4"/>
+        </w:pBdr>
+        <w:shd w:fill="F7F9FC" w:val="clear"/>
+        <w:spacing w:after="120" w:before="60" w:line="200"/>
+        <w:ind w:left="215" w:right="215"/>
+      </w:pPr>
+      <w:r>
+        <w:rPr>
+          <w:rFonts w:ascii="Courier New" w:cs="Courier New" w:eastAsia="Courier New" w:hAnsi="Courier New"/>
+          <w:sz w:val="16"/>
+          <w:szCs w:val="16"/>
+        </w:rPr>
+        <w:t xml:space="preserve">$ curl -i -X POST http://127.0.0.1:8000/api/proyectos -H "Authorization: Bearer &lt;TOKEN&gt;"</w:t>
+      </w:r>
+      <w:r>
+        <w:br/>
+      </w:r>
+      <w:r>
+        <w:rPr>
+          <w:rFonts w:ascii="Courier New" w:cs="Courier New" w:eastAsia="Courier New" w:hAnsi="Courier New"/>
+          <w:sz w:val="16"/>
+          <w:szCs w:val="16"/>
+        </w:rPr>
+        <w:t xml:space="preserve">     -H "Content-Type: application/json" -d '{"nombre":"Sistema de Inventario","fecha_in</w:t>
+      </w:r>
+      <w:r>
+        <w:br/>
+      </w:r>
+      <w:r>
+        <w:rPr>
+          <w:rFonts w:ascii="Courier New" w:cs="Courier New" w:eastAsia="Courier New" w:hAnsi="Courier New"/>
+          <w:sz w:val="16"/>
+          <w:szCs w:val="16"/>
+        </w:rPr>
+        <w:t xml:space="preserve">    icio":"2026-09-15","estado":"Pendiente","responsable":"Diego Abaroa","monto":1250000</w:t>
+      </w:r>
+      <w:r>
+        <w:br/>
+      </w:r>
+      <w:r>
+        <w:rPr>
+          <w:rFonts w:ascii="Courier New" w:cs="Courier New" w:eastAsia="Courier New" w:hAnsi="Courier New"/>
+          <w:sz w:val="16"/>
+          <w:szCs w:val="16"/>
+        </w:rPr>
+        <w:t xml:space="preserve">    0,"created_by":1}'</w:t>
+      </w:r>
+      <w:r>
+        <w:br/>
+      </w:r>
+      <w:r>
+        <w:rPr>
+          <w:rFonts w:ascii="Courier New" w:cs="Courier New" w:eastAsia="Courier New" w:hAnsi="Courier New"/>
+          <w:sz w:val="16"/>
+          <w:szCs w:val="16"/>
+        </w:rPr>
+        <w:t xml:space="preserve">HTTP/1.1 201 Created</w:t>
+      </w:r>
+      <w:r>
+        <w:br/>
+      </w:r>
+      <w:r>
+        <w:rPr>
+          <w:rFonts w:ascii="Courier New" w:cs="Courier New" w:eastAsia="Courier New" w:hAnsi="Courier New"/>
+          <w:sz w:val="16"/>
+          <w:szCs w:val="16"/>
+        </w:rPr>
+        <w:t xml:space="preserve">Host: 127.0.0.1:8000</w:t>
+      </w:r>
+      <w:r>
+        <w:br/>
+      </w:r>
+      <w:r>
+        <w:rPr>
+          <w:rFonts w:ascii="Courier New" w:cs="Courier New" w:eastAsia="Courier New" w:hAnsi="Courier New"/>
+          <w:sz w:val="16"/>
+          <w:szCs w:val="16"/>
+        </w:rPr>
+        <w:t xml:space="preserve">Connection: close</w:t>
+      </w:r>
+      <w:r>
+        <w:br/>
+      </w:r>
+      <w:r>
+        <w:rPr>
+          <w:rFonts w:ascii="Courier New" w:cs="Courier New" w:eastAsia="Courier New" w:hAnsi="Courier New"/>
+          <w:sz w:val="16"/>
+          <w:szCs w:val="16"/>
+        </w:rPr>
+        <w:t xml:space="preserve">X-Powered-By: PHP/8.2.12</w:t>
+      </w:r>
+      <w:r>
+        <w:br/>
+      </w:r>
+      <w:r>
+        <w:rPr>
+          <w:rFonts w:ascii="Courier New" w:cs="Courier New" w:eastAsia="Courier New" w:hAnsi="Courier New"/>
+          <w:sz w:val="16"/>
+          <w:szCs w:val="16"/>
+        </w:rPr>
+        <w:t xml:space="preserve">Cache-Control: no-cache, private</w:t>
+      </w:r>
+      <w:r>
+        <w:br/>
+      </w:r>
+      <w:r>
+        <w:rPr>
+          <w:rFonts w:ascii="Courier New" w:cs="Courier New" w:eastAsia="Courier New" w:hAnsi="Courier New"/>
+          <w:sz w:val="16"/>
+          <w:szCs w:val="16"/>
+        </w:rPr>
+        <w:t xml:space="preserve">Date: Thu, 03 Sep 2026 00:13:49 GMT</w:t>
+      </w:r>
+      <w:r>
+        <w:br/>
+      </w:r>
+      <w:r>
+        <w:rPr>
+          <w:rFonts w:ascii="Courier New" w:cs="Courier New" w:eastAsia="Courier New" w:hAnsi="Courier New"/>
+          <w:sz w:val="16"/>
+          <w:szCs w:val="16"/>
+        </w:rPr>
+        <w:t xml:space="preserve">Content-Type: application/json</w:t>
+      </w:r>
+      <w:r>
+        <w:br/>
+      </w:r>
+      <w:r>
+        <w:rPr>
+          <w:rFonts w:ascii="Courier New" w:cs="Courier New" w:eastAsia="Courier New" w:hAnsi="Courier New"/>
+          <w:sz w:val="16"/>
+          <w:szCs w:val="16"/>
+        </w:rPr>
+        <w:t xml:space="preserve">Access-Control-Allow-Origin: *</w:t>
+      </w:r>
+      <w:r>
+        <w:br/>
+      </w:r>
+      <w:r>
+        <w:rPr>
+          <w:rFonts w:ascii="Courier New" w:cs="Courier New" w:eastAsia="Courier New" w:hAnsi="Courier New"/>
+          <w:sz w:val="16"/>
+          <w:szCs w:val="16"/>
+        </w:rPr>
+        <w:t xml:space="preserve"/>
+      </w:r>
+      <w:r>
+        <w:br/>
+      </w:r>
+      <w:r>
+        <w:rPr>
+          <w:rFonts w:ascii="Courier New" w:cs="Courier New" w:eastAsia="Courier New" w:hAnsi="Courier New"/>
+          <w:sz w:val="16"/>
+          <w:szCs w:val="16"/>
+        </w:rPr>
+        <w:t xml:space="preserve">{"id":4,"nombre":"Sistema de Inventario","fecha_inicio":"2026-09-15","estado":"Pendiente</w:t>
+      </w:r>
+      <w:r>
+        <w:br/>
+      </w:r>
+      <w:r>
+        <w:rPr>
+          <w:rFonts w:ascii="Courier New" w:cs="Courier New" w:eastAsia="Courier New" w:hAnsi="Courier New"/>
+          <w:sz w:val="16"/>
+          <w:szCs w:val="16"/>
+        </w:rPr>
+        <w:t xml:space="preserve">    ","responsable":"Diego Abaroa","monto":"12500000.00","created_by":1,"created_at":"20</w:t>
+      </w:r>
+      <w:r>
+        <w:br/>
+      </w:r>
+      <w:r>
+        <w:rPr>
+          <w:rFonts w:ascii="Courier New" w:cs="Courier New" w:eastAsia="Courier New" w:hAnsi="Courier New"/>
+          <w:sz w:val="16"/>
+          <w:szCs w:val="16"/>
+        </w:rPr>
+        <w:t xml:space="preserve">    26-09-03T00:13:49.000000Z","updated_at":"2026-09-03T00:13:49.000000Z"}</w:t>
+      </w:r>
+    </w:p>
+    <w:p>
+      <w:pPr>
+        <w:pStyle w:val="Heading2"/>
+        <w:spacing w:after="120" w:before="240" w:line="276"/>
+      </w:pPr>
+      <w:r>
+        <w:rPr>
+          <w:rFonts w:ascii="Arial" w:cs="Arial" w:eastAsia="Arial" w:hAnsi="Arial"/>
+          <w:b/>
+          <w:bCs/>
+          <w:color w:val="1B2733"/>
+          <w:sz w:val="24"/>
+          <w:szCs w:val="24"/>
+        </w:rPr>
+        <w:t xml:space="preserve">INDICADOR 1 - Crear con campos vacios (422)</w:t>
+      </w:r>
+    </w:p>
+    <w:p>
+      <w:pPr>
+        <w:pBdr>
+          <w:top w:val="single" w:color="DDE3EC" w:sz="4"/>
+          <w:bottom w:val="single" w:color="DDE3EC" w:sz="4"/>
+          <w:left w:val="single" w:color="DDE3EC" w:sz="4"/>
+          <w:right w:val="single" w:color="DDE3EC" w:sz="4"/>
+        </w:pBdr>
+        <w:shd w:fill="F7F9FC" w:val="clear"/>
+        <w:spacing w:after="120" w:before="60" w:line="200"/>
+        <w:ind w:left="215" w:right="215"/>
+      </w:pPr>
+      <w:r>
+        <w:rPr>
+          <w:rFonts w:ascii="Courier New" w:cs="Courier New" w:eastAsia="Courier New" w:hAnsi="Courier New"/>
+          <w:sz w:val="16"/>
+          <w:szCs w:val="16"/>
+        </w:rPr>
+        <w:t xml:space="preserve">$ curl -i -X POST http://127.0.0.1:8000/api/proyectos -H "Authorization: Bearer &lt;TOKEN&gt;"</w:t>
+      </w:r>
+      <w:r>
+        <w:br/>
+      </w:r>
+      <w:r>
+        <w:rPr>
+          <w:rFonts w:ascii="Courier New" w:cs="Courier New" w:eastAsia="Courier New" w:hAnsi="Courier New"/>
+          <w:sz w:val="16"/>
+          <w:szCs w:val="16"/>
+        </w:rPr>
+        <w:t xml:space="preserve">     -H "Content-Type: application/json" -d '{"nombre":"","fecha_inicio":"","estado":"",</w:t>
+      </w:r>
+      <w:r>
+        <w:br/>
+      </w:r>
+      <w:r>
+        <w:rPr>
+          <w:rFonts w:ascii="Courier New" w:cs="Courier New" w:eastAsia="Courier New" w:hAnsi="Courier New"/>
+          <w:sz w:val="16"/>
+          <w:szCs w:val="16"/>
+        </w:rPr>
+        <w:t xml:space="preserve">    "responsable":"","monto":"","created_by":""}'</w:t>
+      </w:r>
+      <w:r>
+        <w:br/>
+      </w:r>
+      <w:r>
+        <w:rPr>
+          <w:rFonts w:ascii="Courier New" w:cs="Courier New" w:eastAsia="Courier New" w:hAnsi="Courier New"/>
+          <w:sz w:val="16"/>
+          <w:szCs w:val="16"/>
+        </w:rPr>
+        <w:t xml:space="preserve">HTTP/1.1 422 Unprocessable Content</w:t>
+      </w:r>
+      <w:r>
+        <w:br/>
+      </w:r>
+      <w:r>
+        <w:rPr>
+          <w:rFonts w:ascii="Courier New" w:cs="Courier New" w:eastAsia="Courier New" w:hAnsi="Courier New"/>
+          <w:sz w:val="16"/>
+          <w:szCs w:val="16"/>
+        </w:rPr>
+        <w:t xml:space="preserve">Host: 127.0.0.1:8000</w:t>
+      </w:r>
+      <w:r>
+        <w:br/>
+      </w:r>
+      <w:r>
+        <w:rPr>
+          <w:rFonts w:ascii="Courier New" w:cs="Courier New" w:eastAsia="Courier New" w:hAnsi="Courier New"/>
+          <w:sz w:val="16"/>
+          <w:szCs w:val="16"/>
+        </w:rPr>
+        <w:t xml:space="preserve">Connection: close</w:t>
+      </w:r>
+      <w:r>
+        <w:br/>
+      </w:r>
+      <w:r>
+        <w:rPr>
+          <w:rFonts w:ascii="Courier New" w:cs="Courier New" w:eastAsia="Courier New" w:hAnsi="Courier New"/>
+          <w:sz w:val="16"/>
+          <w:szCs w:val="16"/>
+        </w:rPr>
+        <w:t xml:space="preserve">X-Powered-By: PHP/8.2.12</w:t>
+      </w:r>
+      <w:r>
+        <w:br/>
+      </w:r>
+      <w:r>
+        <w:rPr>
+          <w:rFonts w:ascii="Courier New" w:cs="Courier New" w:eastAsia="Courier New" w:hAnsi="Courier New"/>
+          <w:sz w:val="16"/>
+          <w:szCs w:val="16"/>
+        </w:rPr>
+        <w:t xml:space="preserve">Cache-Control: no-cache, private</w:t>
+      </w:r>
+      <w:r>
+        <w:br/>
+      </w:r>
+      <w:r>
+        <w:rPr>
+          <w:rFonts w:ascii="Courier New" w:cs="Courier New" w:eastAsia="Courier New" w:hAnsi="Courier New"/>
+          <w:sz w:val="16"/>
+          <w:szCs w:val="16"/>
+        </w:rPr>
+        <w:t xml:space="preserve">Date: Thu, 03 Sep 2026 00:13:49 GMT</w:t>
+      </w:r>
+      <w:r>
+        <w:br/>
+      </w:r>
+      <w:r>
+        <w:rPr>
+          <w:rFonts w:ascii="Courier New" w:cs="Courier New" w:eastAsia="Courier New" w:hAnsi="Courier New"/>
+          <w:sz w:val="16"/>
+          <w:szCs w:val="16"/>
+        </w:rPr>
+        <w:t xml:space="preserve">Content-Type: application/json</w:t>
+      </w:r>
+      <w:r>
+        <w:br/>
+      </w:r>
+      <w:r>
+        <w:rPr>
+          <w:rFonts w:ascii="Courier New" w:cs="Courier New" w:eastAsia="Courier New" w:hAnsi="Courier New"/>
+          <w:sz w:val="16"/>
+          <w:szCs w:val="16"/>
+        </w:rPr>
+        <w:t xml:space="preserve">Access-Control-Allow-Origin: *</w:t>
+      </w:r>
+      <w:r>
+        <w:br/>
+      </w:r>
+      <w:r>
+        <w:rPr>
+          <w:rFonts w:ascii="Courier New" w:cs="Courier New" w:eastAsia="Courier New" w:hAnsi="Courier New"/>
+          <w:sz w:val="16"/>
+          <w:szCs w:val="16"/>
+        </w:rPr>
+        <w:t xml:space="preserve"/>
+      </w:r>
+      <w:r>
+        <w:br/>
+      </w:r>
+      <w:r>
+        <w:rPr>
+          <w:rFonts w:ascii="Courier New" w:cs="Courier New" w:eastAsia="Courier New" w:hAnsi="Courier New"/>
+          <w:sz w:val="16"/>
+          <w:szCs w:val="16"/>
+        </w:rPr>
+        <w:t xml:space="preserve">{"message":"Los datos enviados no son validos.","errors":{"nombre":["El campo nombre es </w:t>
+      </w:r>
+      <w:r>
+        <w:br/>
+      </w:r>
+      <w:r>
+        <w:rPr>
+          <w:rFonts w:ascii="Courier New" w:cs="Courier New" w:eastAsia="Courier New" w:hAnsi="Courier New"/>
+          <w:sz w:val="16"/>
+          <w:szCs w:val="16"/>
+        </w:rPr>
+        <w:t xml:space="preserve">    obligatorio y no puede estar vacio."],"fecha_inicio":["El campo fecha inicio es obli</w:t>
+      </w:r>
+      <w:r>
+        <w:br/>
+      </w:r>
+      <w:r>
+        <w:rPr>
+          <w:rFonts w:ascii="Courier New" w:cs="Courier New" w:eastAsia="Courier New" w:hAnsi="Courier New"/>
+          <w:sz w:val="16"/>
+          <w:szCs w:val="16"/>
+        </w:rPr>
+        <w:t xml:space="preserve">    gatorio y no puede estar vacio."],"estado":["El campo estado es obligatorio y no pue</w:t>
+      </w:r>
+      <w:r>
+        <w:br/>
+      </w:r>
+      <w:r>
+        <w:rPr>
+          <w:rFonts w:ascii="Courier New" w:cs="Courier New" w:eastAsia="Courier New" w:hAnsi="Courier New"/>
+          <w:sz w:val="16"/>
+          <w:szCs w:val="16"/>
+        </w:rPr>
+        <w:t xml:space="preserve">    de estar vacio."],"responsable":["El campo responsable es obligatorio y no puede est</w:t>
+      </w:r>
+      <w:r>
+        <w:br/>
+      </w:r>
+      <w:r>
+        <w:rPr>
+          <w:rFonts w:ascii="Courier New" w:cs="Courier New" w:eastAsia="Courier New" w:hAnsi="Courier New"/>
+          <w:sz w:val="16"/>
+          <w:szCs w:val="16"/>
+        </w:rPr>
+        <w:t xml:space="preserve">    ar vacio."],"monto":["El campo monto es obligatorio y no puede estar vacio."],"creat</w:t>
+      </w:r>
+      <w:r>
+        <w:br/>
+      </w:r>
+      <w:r>
+        <w:rPr>
+          <w:rFonts w:ascii="Courier New" w:cs="Courier New" w:eastAsia="Courier New" w:hAnsi="Courier New"/>
+          <w:sz w:val="16"/>
+          <w:szCs w:val="16"/>
+        </w:rPr>
+        <w:t xml:space="preserve">    ed_by":["El campo created by es obligatorio y no puede estar vacio."]}}</w:t>
+      </w:r>
+    </w:p>
+    <w:p>
+      <w:pPr>
+        <w:pStyle w:val="Heading2"/>
+        <w:spacing w:after="120" w:before="240" w:line="276"/>
+      </w:pPr>
+      <w:r>
+        <w:rPr>
+          <w:rFonts w:ascii="Arial" w:cs="Arial" w:eastAsia="Arial" w:hAnsi="Arial"/>
+          <w:b/>
+          <w:bCs/>
+          <w:color w:val="1B2733"/>
+          <w:sz w:val="24"/>
+          <w:szCs w:val="24"/>
+        </w:rPr>
+        <w:t xml:space="preserve">INDICADOR 2 - Obtener proyecto por Id (200 OK)</w:t>
+      </w:r>
+    </w:p>
+    <w:p>
+      <w:pPr>
+        <w:pBdr>
+          <w:top w:val="single" w:color="DDE3EC" w:sz="4"/>
+          <w:bottom w:val="single" w:color="DDE3EC" w:sz="4"/>
+          <w:left w:val="single" w:color="DDE3EC" w:sz="4"/>
+          <w:right w:val="single" w:color="DDE3EC" w:sz="4"/>
+        </w:pBdr>
+        <w:shd w:fill="F7F9FC" w:val="clear"/>
+        <w:spacing w:after="120" w:before="60" w:line="200"/>
+        <w:ind w:left="215" w:right="215"/>
+      </w:pPr>
+      <w:r>
+        <w:rPr>
+          <w:rFonts w:ascii="Courier New" w:cs="Courier New" w:eastAsia="Courier New" w:hAnsi="Courier New"/>
+          <w:sz w:val="16"/>
+          <w:szCs w:val="16"/>
+        </w:rPr>
+        <w:t xml:space="preserve">$ curl -i -X GET http://127.0.0.1:8000/api/proyectos/1 -H "Authorization: Bearer &lt;TOKEN&gt;</w:t>
+      </w:r>
+      <w:r>
+        <w:br/>
+      </w:r>
+      <w:r>
+        <w:rPr>
+          <w:rFonts w:ascii="Courier New" w:cs="Courier New" w:eastAsia="Courier New" w:hAnsi="Courier New"/>
+          <w:sz w:val="16"/>
+          <w:szCs w:val="16"/>
+        </w:rPr>
+        <w:t xml:space="preserve">    "</w:t>
+      </w:r>
+      <w:r>
+        <w:br/>
+      </w:r>
+      <w:r>
+        <w:rPr>
+          <w:rFonts w:ascii="Courier New" w:cs="Courier New" w:eastAsia="Courier New" w:hAnsi="Courier New"/>
+          <w:sz w:val="16"/>
+          <w:szCs w:val="16"/>
+        </w:rPr>
+        <w:t xml:space="preserve">HTTP/1.1 200 OK</w:t>
+      </w:r>
+      <w:r>
+        <w:br/>
+      </w:r>
+      <w:r>
+        <w:rPr>
+          <w:rFonts w:ascii="Courier New" w:cs="Courier New" w:eastAsia="Courier New" w:hAnsi="Courier New"/>
+          <w:sz w:val="16"/>
+          <w:szCs w:val="16"/>
+        </w:rPr>
+        <w:t xml:space="preserve">Host: 127.0.0.1:8000</w:t>
+      </w:r>
+      <w:r>
+        <w:br/>
+      </w:r>
+      <w:r>
+        <w:rPr>
+          <w:rFonts w:ascii="Courier New" w:cs="Courier New" w:eastAsia="Courier New" w:hAnsi="Courier New"/>
+          <w:sz w:val="16"/>
+          <w:szCs w:val="16"/>
+        </w:rPr>
+        <w:t xml:space="preserve">Connection: close</w:t>
+      </w:r>
+      <w:r>
+        <w:br/>
+      </w:r>
+      <w:r>
+        <w:rPr>
+          <w:rFonts w:ascii="Courier New" w:cs="Courier New" w:eastAsia="Courier New" w:hAnsi="Courier New"/>
+          <w:sz w:val="16"/>
+          <w:szCs w:val="16"/>
+        </w:rPr>
+        <w:t xml:space="preserve">X-Powered-By: PHP/8.2.12</w:t>
+      </w:r>
+      <w:r>
+        <w:br/>
+      </w:r>
+      <w:r>
+        <w:rPr>
+          <w:rFonts w:ascii="Courier New" w:cs="Courier New" w:eastAsia="Courier New" w:hAnsi="Courier New"/>
+          <w:sz w:val="16"/>
+          <w:szCs w:val="16"/>
+        </w:rPr>
+        <w:t xml:space="preserve">Cache-Control: no-cache, private</w:t>
+      </w:r>
+      <w:r>
+        <w:br/>
+      </w:r>
+      <w:r>
+        <w:rPr>
+          <w:rFonts w:ascii="Courier New" w:cs="Courier New" w:eastAsia="Courier New" w:hAnsi="Courier New"/>
+          <w:sz w:val="16"/>
+          <w:szCs w:val="16"/>
+        </w:rPr>
+        <w:t xml:space="preserve">Date: Thu, 03 Sep 2026 00:13:49 GMT</w:t>
+      </w:r>
+      <w:r>
+        <w:br/>
+      </w:r>
+      <w:r>
+        <w:rPr>
+          <w:rFonts w:ascii="Courier New" w:cs="Courier New" w:eastAsia="Courier New" w:hAnsi="Courier New"/>
+          <w:sz w:val="16"/>
+          <w:szCs w:val="16"/>
+        </w:rPr>
+        <w:t xml:space="preserve">Content-Type: application/json</w:t>
+      </w:r>
+      <w:r>
+        <w:br/>
+      </w:r>
+      <w:r>
+        <w:rPr>
+          <w:rFonts w:ascii="Courier New" w:cs="Courier New" w:eastAsia="Courier New" w:hAnsi="Courier New"/>
+          <w:sz w:val="16"/>
+          <w:szCs w:val="16"/>
+        </w:rPr>
+        <w:t xml:space="preserve">Access-Control-Allow-Origin: *</w:t>
+      </w:r>
+      <w:r>
+        <w:br/>
+      </w:r>
+      <w:r>
+        <w:rPr>
+          <w:rFonts w:ascii="Courier New" w:cs="Courier New" w:eastAsia="Courier New" w:hAnsi="Courier New"/>
+          <w:sz w:val="16"/>
+          <w:szCs w:val="16"/>
+        </w:rPr>
+        <w:t xml:space="preserve"/>
+      </w:r>
+      <w:r>
+        <w:br/>
+      </w:r>
+      <w:r>
+        <w:rPr>
+          <w:rFonts w:ascii="Courier New" w:cs="Courier New" w:eastAsia="Courier New" w:hAnsi="Courier New"/>
+          <w:sz w:val="16"/>
+          <w:szCs w:val="16"/>
+        </w:rPr>
+        <w:t xml:space="preserve">{"id":1,"nombre":"Migracion ERP Corporativo","fecha_inicio":"2026-03-10","estado":"En Pr</w:t>
+      </w:r>
+      <w:r>
+        <w:br/>
+      </w:r>
+      <w:r>
+        <w:rPr>
+          <w:rFonts w:ascii="Courier New" w:cs="Courier New" w:eastAsia="Courier New" w:hAnsi="Courier New"/>
+          <w:sz w:val="16"/>
+          <w:szCs w:val="16"/>
+        </w:rPr>
+        <w:t xml:space="preserve">    oceso","responsable":"Camila Rojas","monto":"18500000.00","created_by":1,"created_at</w:t>
+      </w:r>
+      <w:r>
+        <w:br/>
+      </w:r>
+      <w:r>
+        <w:rPr>
+          <w:rFonts w:ascii="Courier New" w:cs="Courier New" w:eastAsia="Courier New" w:hAnsi="Courier New"/>
+          <w:sz w:val="16"/>
+          <w:szCs w:val="16"/>
+        </w:rPr>
+        <w:t xml:space="preserve">    ":"2026-09-03T00:13:33.000000Z","updated_at":"2026-09-03T00:13:33.000000Z"}</w:t>
+      </w:r>
+    </w:p>
+    <w:p>
+      <w:pPr>
+        <w:pStyle w:val="Heading2"/>
+        <w:spacing w:after="120" w:before="240" w:line="276"/>
+      </w:pPr>
+      <w:r>
+        <w:rPr>
+          <w:rFonts w:ascii="Arial" w:cs="Arial" w:eastAsia="Arial" w:hAnsi="Arial"/>
+          <w:b/>
+          <w:bCs/>
+          <w:color w:val="1B2733"/>
+          <w:sz w:val="24"/>
+          <w:szCs w:val="24"/>
+        </w:rPr>
+        <w:t xml:space="preserve">INDICADOR 2 - Id inexistente (404 Not Found)</w:t>
+      </w:r>
+    </w:p>
+    <w:p>
+      <w:pPr>
+        <w:pBdr>
+          <w:top w:val="single" w:color="DDE3EC" w:sz="4"/>
+          <w:bottom w:val="single" w:color="DDE3EC" w:sz="4"/>
+          <w:left w:val="single" w:color="DDE3EC" w:sz="4"/>
+          <w:right w:val="single" w:color="DDE3EC" w:sz="4"/>
+        </w:pBdr>
+        <w:shd w:fill="F7F9FC" w:val="clear"/>
+        <w:spacing w:after="120" w:before="60" w:line="200"/>
+        <w:ind w:left="215" w:right="215"/>
+      </w:pPr>
+      <w:r>
+        <w:rPr>
+          <w:rFonts w:ascii="Courier New" w:cs="Courier New" w:eastAsia="Courier New" w:hAnsi="Courier New"/>
+          <w:sz w:val="16"/>
+          <w:szCs w:val="16"/>
+        </w:rPr>
+        <w:t xml:space="preserve">$ curl -i -X GET http://127.0.0.1:8000/api/proyectos/9999 -H "Authorization: Bearer &lt;TOK</w:t>
+      </w:r>
+      <w:r>
+        <w:br/>
+      </w:r>
+      <w:r>
+        <w:rPr>
+          <w:rFonts w:ascii="Courier New" w:cs="Courier New" w:eastAsia="Courier New" w:hAnsi="Courier New"/>
+          <w:sz w:val="16"/>
+          <w:szCs w:val="16"/>
+        </w:rPr>
+        <w:t xml:space="preserve">    EN&gt;"</w:t>
+      </w:r>
+      <w:r>
+        <w:br/>
+      </w:r>
+      <w:r>
+        <w:rPr>
+          <w:rFonts w:ascii="Courier New" w:cs="Courier New" w:eastAsia="Courier New" w:hAnsi="Courier New"/>
+          <w:sz w:val="16"/>
+          <w:szCs w:val="16"/>
+        </w:rPr>
+        <w:t xml:space="preserve">HTTP/1.1 404 Not Found</w:t>
+      </w:r>
+      <w:r>
+        <w:br/>
+      </w:r>
+      <w:r>
+        <w:rPr>
+          <w:rFonts w:ascii="Courier New" w:cs="Courier New" w:eastAsia="Courier New" w:hAnsi="Courier New"/>
+          <w:sz w:val="16"/>
+          <w:szCs w:val="16"/>
+        </w:rPr>
+        <w:t xml:space="preserve">Host: 127.0.0.1:8000</w:t>
+      </w:r>
+      <w:r>
+        <w:br/>
+      </w:r>
+      <w:r>
+        <w:rPr>
+          <w:rFonts w:ascii="Courier New" w:cs="Courier New" w:eastAsia="Courier New" w:hAnsi="Courier New"/>
+          <w:sz w:val="16"/>
+          <w:szCs w:val="16"/>
+        </w:rPr>
+        <w:t xml:space="preserve">Connection: close</w:t>
+      </w:r>
+      <w:r>
+        <w:br/>
+      </w:r>
+      <w:r>
+        <w:rPr>
+          <w:rFonts w:ascii="Courier New" w:cs="Courier New" w:eastAsia="Courier New" w:hAnsi="Courier New"/>
+          <w:sz w:val="16"/>
+          <w:szCs w:val="16"/>
+        </w:rPr>
+        <w:t xml:space="preserve">X-Powered-By: PHP/8.2.12</w:t>
+      </w:r>
+      <w:r>
+        <w:br/>
+      </w:r>
+      <w:r>
+        <w:rPr>
+          <w:rFonts w:ascii="Courier New" w:cs="Courier New" w:eastAsia="Courier New" w:hAnsi="Courier New"/>
+          <w:sz w:val="16"/>
+          <w:szCs w:val="16"/>
+        </w:rPr>
+        <w:t xml:space="preserve">Cache-Control: no-cache, private</w:t>
+      </w:r>
+      <w:r>
+        <w:br/>
+      </w:r>
+      <w:r>
+        <w:rPr>
+          <w:rFonts w:ascii="Courier New" w:cs="Courier New" w:eastAsia="Courier New" w:hAnsi="Courier New"/>
+          <w:sz w:val="16"/>
+          <w:szCs w:val="16"/>
+        </w:rPr>
+        <w:t xml:space="preserve">Date: Thu, 03 Sep 2026 00:13:49 GMT</w:t>
+      </w:r>
+      <w:r>
+        <w:br/>
+      </w:r>
+      <w:r>
+        <w:rPr>
+          <w:rFonts w:ascii="Courier New" w:cs="Courier New" w:eastAsia="Courier New" w:hAnsi="Courier New"/>
+          <w:sz w:val="16"/>
+          <w:szCs w:val="16"/>
+        </w:rPr>
+        <w:t xml:space="preserve">Content-Type: application/json</w:t>
+      </w:r>
+      <w:r>
+        <w:br/>
+      </w:r>
+      <w:r>
+        <w:rPr>
+          <w:rFonts w:ascii="Courier New" w:cs="Courier New" w:eastAsia="Courier New" w:hAnsi="Courier New"/>
+          <w:sz w:val="16"/>
+          <w:szCs w:val="16"/>
+        </w:rPr>
+        <w:t xml:space="preserve">Access-Control-Allow-Origin: *</w:t>
+      </w:r>
+      <w:r>
+        <w:br/>
+      </w:r>
+      <w:r>
+        <w:rPr>
+          <w:rFonts w:ascii="Courier New" w:cs="Courier New" w:eastAsia="Courier New" w:hAnsi="Courier New"/>
+          <w:sz w:val="16"/>
+          <w:szCs w:val="16"/>
+        </w:rPr>
+        <w:t xml:space="preserve"/>
+      </w:r>
+      <w:r>
+        <w:br/>
+      </w:r>
+      <w:r>
+        <w:rPr>
+          <w:rFonts w:ascii="Courier New" w:cs="Courier New" w:eastAsia="Courier New" w:hAnsi="Courier New"/>
+          <w:sz w:val="16"/>
+          <w:szCs w:val="16"/>
+        </w:rPr>
+        <w:t xml:space="preserve">{"message":"Proyecto no encontrado.","id":"9999"}</w:t>
+      </w:r>
+    </w:p>
+    <w:p>
+      <w:pPr>
+        <w:pStyle w:val="Heading2"/>
+        <w:spacing w:after="120" w:before="240" w:line="276"/>
+      </w:pPr>
+      <w:r>
+        <w:rPr>
+          <w:rFonts w:ascii="Arial" w:cs="Arial" w:eastAsia="Arial" w:hAnsi="Arial"/>
+          <w:b/>
+          <w:bCs/>
+          <w:color w:val="1B2733"/>
+          <w:sz w:val="24"/>
+          <w:szCs w:val="24"/>
+        </w:rPr>
+        <w:t xml:space="preserve">INDICADOR 3 - Actualizar proyecto (200 OK)</w:t>
+      </w:r>
+    </w:p>
+    <w:p>
+      <w:pPr>
+        <w:pBdr>
+          <w:top w:val="single" w:color="DDE3EC" w:sz="4"/>
+          <w:bottom w:val="single" w:color="DDE3EC" w:sz="4"/>
+          <w:left w:val="single" w:color="DDE3EC" w:sz="4"/>
+          <w:right w:val="single" w:color="DDE3EC" w:sz="4"/>
+        </w:pBdr>
+        <w:shd w:fill="F7F9FC" w:val="clear"/>
+        <w:spacing w:after="120" w:before="60" w:line="200"/>
+        <w:ind w:left="215" w:right="215"/>
+      </w:pPr>
+      <w:r>
+        <w:rPr>
+          <w:rFonts w:ascii="Courier New" w:cs="Courier New" w:eastAsia="Courier New" w:hAnsi="Courier New"/>
+          <w:sz w:val="16"/>
+          <w:szCs w:val="16"/>
+        </w:rPr>
+        <w:t xml:space="preserve">$ curl -i -X PUT http://127.0.0.1:8000/api/proyectos/1 -H "Authorization: Bearer &lt;TOKEN&gt;</w:t>
+      </w:r>
+      <w:r>
+        <w:br/>
+      </w:r>
+      <w:r>
+        <w:rPr>
+          <w:rFonts w:ascii="Courier New" w:cs="Courier New" w:eastAsia="Courier New" w:hAnsi="Courier New"/>
+          <w:sz w:val="16"/>
+          <w:szCs w:val="16"/>
+        </w:rPr>
+        <w:t xml:space="preserve">    " -H "Content-Type: application/json" -d '{"nombre":"Migracion ERP Corporativo v2","</w:t>
+      </w:r>
+      <w:r>
+        <w:br/>
+      </w:r>
+      <w:r>
+        <w:rPr>
+          <w:rFonts w:ascii="Courier New" w:cs="Courier New" w:eastAsia="Courier New" w:hAnsi="Courier New"/>
+          <w:sz w:val="16"/>
+          <w:szCs w:val="16"/>
+        </w:rPr>
+        <w:t xml:space="preserve">    fecha_inicio":"2026-04-01","estado":"Finalizado","responsable":"Camila Rojas","monto</w:t>
+      </w:r>
+      <w:r>
+        <w:br/>
+      </w:r>
+      <w:r>
+        <w:rPr>
+          <w:rFonts w:ascii="Courier New" w:cs="Courier New" w:eastAsia="Courier New" w:hAnsi="Courier New"/>
+          <w:sz w:val="16"/>
+          <w:szCs w:val="16"/>
+        </w:rPr>
+        <w:t xml:space="preserve">    ":20000000,"created_by":1}'</w:t>
+      </w:r>
+      <w:r>
+        <w:br/>
+      </w:r>
+      <w:r>
+        <w:rPr>
+          <w:rFonts w:ascii="Courier New" w:cs="Courier New" w:eastAsia="Courier New" w:hAnsi="Courier New"/>
+          <w:sz w:val="16"/>
+          <w:szCs w:val="16"/>
+        </w:rPr>
+        <w:t xml:space="preserve">HTTP/1.1 200 OK</w:t>
+      </w:r>
+      <w:r>
+        <w:br/>
+      </w:r>
+      <w:r>
+        <w:rPr>
+          <w:rFonts w:ascii="Courier New" w:cs="Courier New" w:eastAsia="Courier New" w:hAnsi="Courier New"/>
+          <w:sz w:val="16"/>
+          <w:szCs w:val="16"/>
+        </w:rPr>
+        <w:t xml:space="preserve">Host: 127.0.0.1:8000</w:t>
+      </w:r>
+      <w:r>
+        <w:br/>
+      </w:r>
+      <w:r>
+        <w:rPr>
+          <w:rFonts w:ascii="Courier New" w:cs="Courier New" w:eastAsia="Courier New" w:hAnsi="Courier New"/>
+          <w:sz w:val="16"/>
+          <w:szCs w:val="16"/>
+        </w:rPr>
+        <w:t xml:space="preserve">Connection: close</w:t>
+      </w:r>
+      <w:r>
+        <w:br/>
+      </w:r>
+      <w:r>
+        <w:rPr>
+          <w:rFonts w:ascii="Courier New" w:cs="Courier New" w:eastAsia="Courier New" w:hAnsi="Courier New"/>
+          <w:sz w:val="16"/>
+          <w:szCs w:val="16"/>
+        </w:rPr>
+        <w:t xml:space="preserve">X-Powered-By: PHP/8.2.12</w:t>
+      </w:r>
+      <w:r>
+        <w:br/>
+      </w:r>
+      <w:r>
+        <w:rPr>
+          <w:rFonts w:ascii="Courier New" w:cs="Courier New" w:eastAsia="Courier New" w:hAnsi="Courier New"/>
+          <w:sz w:val="16"/>
+          <w:szCs w:val="16"/>
+        </w:rPr>
+        <w:t xml:space="preserve">Cache-Control: no-cache, private</w:t>
+      </w:r>
+      <w:r>
+        <w:br/>
+      </w:r>
+      <w:r>
+        <w:rPr>
+          <w:rFonts w:ascii="Courier New" w:cs="Courier New" w:eastAsia="Courier New" w:hAnsi="Courier New"/>
+          <w:sz w:val="16"/>
+          <w:szCs w:val="16"/>
+        </w:rPr>
+        <w:t xml:space="preserve">Date: Thu, 03 Sep 2026 00:13:50 GMT</w:t>
+      </w:r>
+      <w:r>
+        <w:br/>
+      </w:r>
+      <w:r>
+        <w:rPr>
+          <w:rFonts w:ascii="Courier New" w:cs="Courier New" w:eastAsia="Courier New" w:hAnsi="Courier New"/>
+          <w:sz w:val="16"/>
+          <w:szCs w:val="16"/>
+        </w:rPr>
+        <w:t xml:space="preserve">Content-Type: application/json</w:t>
+      </w:r>
+      <w:r>
+        <w:br/>
+      </w:r>
+      <w:r>
+        <w:rPr>
+          <w:rFonts w:ascii="Courier New" w:cs="Courier New" w:eastAsia="Courier New" w:hAnsi="Courier New"/>
+          <w:sz w:val="16"/>
+          <w:szCs w:val="16"/>
+        </w:rPr>
+        <w:t xml:space="preserve">Access-Control-Allow-Origin: *</w:t>
+      </w:r>
+      <w:r>
+        <w:br/>
+      </w:r>
+      <w:r>
+        <w:rPr>
+          <w:rFonts w:ascii="Courier New" w:cs="Courier New" w:eastAsia="Courier New" w:hAnsi="Courier New"/>
+          <w:sz w:val="16"/>
+          <w:szCs w:val="16"/>
+        </w:rPr>
+        <w:t xml:space="preserve"/>
+      </w:r>
+      <w:r>
+        <w:br/>
+      </w:r>
+      <w:r>
+        <w:rPr>
+          <w:rFonts w:ascii="Courier New" w:cs="Courier New" w:eastAsia="Courier New" w:hAnsi="Courier New"/>
+          <w:sz w:val="16"/>
+          <w:szCs w:val="16"/>
+        </w:rPr>
+        <w:t xml:space="preserve">{"id":1,"nombre":"Migracion ERP Corporativo v2","fecha_inicio":"2026-04-01","estado":"Fi</w:t>
+      </w:r>
+      <w:r>
+        <w:br/>
+      </w:r>
+      <w:r>
+        <w:rPr>
+          <w:rFonts w:ascii="Courier New" w:cs="Courier New" w:eastAsia="Courier New" w:hAnsi="Courier New"/>
+          <w:sz w:val="16"/>
+          <w:szCs w:val="16"/>
+        </w:rPr>
+        <w:t xml:space="preserve">    nalizado","responsable":"Camila Rojas","monto":"20000000.00","created_by":1,"created</w:t>
+      </w:r>
+      <w:r>
+        <w:br/>
+      </w:r>
+      <w:r>
+        <w:rPr>
+          <w:rFonts w:ascii="Courier New" w:cs="Courier New" w:eastAsia="Courier New" w:hAnsi="Courier New"/>
+          <w:sz w:val="16"/>
+          <w:szCs w:val="16"/>
+        </w:rPr>
+        <w:t xml:space="preserve">    _at":"2026-09-03T00:13:33.000000Z","updated_at":"2026-09-03T00:13:50.000000Z"}</w:t>
+      </w:r>
+    </w:p>
+    <w:p>
+      <w:pPr>
+        <w:pStyle w:val="Heading2"/>
+        <w:spacing w:after="120" w:before="240" w:line="276"/>
+      </w:pPr>
+      <w:r>
+        <w:rPr>
+          <w:rFonts w:ascii="Arial" w:cs="Arial" w:eastAsia="Arial" w:hAnsi="Arial"/>
+          <w:b/>
+          <w:bCs/>
+          <w:color w:val="1B2733"/>
+          <w:sz w:val="24"/>
+          <w:szCs w:val="24"/>
+        </w:rPr>
+        <w:t xml:space="preserve">INDICADOR 4 - Eliminar proyecto (204 No Content)</w:t>
+      </w:r>
+    </w:p>
+    <w:p>
+      <w:pPr>
+        <w:pBdr>
+          <w:top w:val="single" w:color="DDE3EC" w:sz="4"/>
+          <w:bottom w:val="single" w:color="DDE3EC" w:sz="4"/>
+          <w:left w:val="single" w:color="DDE3EC" w:sz="4"/>
+          <w:right w:val="single" w:color="DDE3EC" w:sz="4"/>
+        </w:pBdr>
+        <w:shd w:fill="F7F9FC" w:val="clear"/>
+        <w:spacing w:after="120" w:before="60" w:line="200"/>
+        <w:ind w:left="215" w:right="215"/>
+      </w:pPr>
+      <w:r>
+        <w:rPr>
+          <w:rFonts w:ascii="Courier New" w:cs="Courier New" w:eastAsia="Courier New" w:hAnsi="Courier New"/>
+          <w:sz w:val="16"/>
+          <w:szCs w:val="16"/>
+        </w:rPr>
+        <w:t xml:space="preserve">$ curl -i -X DELETE http://127.0.0.1:8000/api/proyectos/3 -H "Authorization: Bearer &lt;TOK</w:t>
+      </w:r>
+      <w:r>
+        <w:br/>
+      </w:r>
+      <w:r>
+        <w:rPr>
+          <w:rFonts w:ascii="Courier New" w:cs="Courier New" w:eastAsia="Courier New" w:hAnsi="Courier New"/>
+          <w:sz w:val="16"/>
+          <w:szCs w:val="16"/>
+        </w:rPr>
+        <w:t xml:space="preserve">    EN&gt;"</w:t>
+      </w:r>
+      <w:r>
+        <w:br/>
+      </w:r>
+      <w:r>
+        <w:rPr>
+          <w:rFonts w:ascii="Courier New" w:cs="Courier New" w:eastAsia="Courier New" w:hAnsi="Courier New"/>
+          <w:sz w:val="16"/>
+          <w:szCs w:val="16"/>
+        </w:rPr>
+        <w:t xml:space="preserve">HTTP/1.1 204 No Content</w:t>
+      </w:r>
+      <w:r>
+        <w:br/>
+      </w:r>
+      <w:r>
+        <w:rPr>
+          <w:rFonts w:ascii="Courier New" w:cs="Courier New" w:eastAsia="Courier New" w:hAnsi="Courier New"/>
+          <w:sz w:val="16"/>
+          <w:szCs w:val="16"/>
+        </w:rPr>
+        <w:t xml:space="preserve">Host: 127.0.0.1:8000</w:t>
+      </w:r>
+      <w:r>
+        <w:br/>
+      </w:r>
+      <w:r>
+        <w:rPr>
+          <w:rFonts w:ascii="Courier New" w:cs="Courier New" w:eastAsia="Courier New" w:hAnsi="Courier New"/>
+          <w:sz w:val="16"/>
+          <w:szCs w:val="16"/>
+        </w:rPr>
+        <w:t xml:space="preserve">Connection: close</w:t>
+      </w:r>
+      <w:r>
+        <w:br/>
+      </w:r>
+      <w:r>
+        <w:rPr>
+          <w:rFonts w:ascii="Courier New" w:cs="Courier New" w:eastAsia="Courier New" w:hAnsi="Courier New"/>
+          <w:sz w:val="16"/>
+          <w:szCs w:val="16"/>
+        </w:rPr>
+        <w:t xml:space="preserve">X-Powered-By: PHP/8.2.12</w:t>
+      </w:r>
+      <w:r>
+        <w:br/>
+      </w:r>
+      <w:r>
+        <w:rPr>
+          <w:rFonts w:ascii="Courier New" w:cs="Courier New" w:eastAsia="Courier New" w:hAnsi="Courier New"/>
+          <w:sz w:val="16"/>
+          <w:szCs w:val="16"/>
+        </w:rPr>
+        <w:t xml:space="preserve">Cache-Control: no-cache, private</w:t>
+      </w:r>
+      <w:r>
+        <w:br/>
+      </w:r>
+      <w:r>
+        <w:rPr>
+          <w:rFonts w:ascii="Courier New" w:cs="Courier New" w:eastAsia="Courier New" w:hAnsi="Courier New"/>
+          <w:sz w:val="16"/>
+          <w:szCs w:val="16"/>
+        </w:rPr>
+        <w:t xml:space="preserve">Date: Thu, 03 Sep 2026 00:13:50 GMT</w:t>
+      </w:r>
+      <w:r>
+        <w:br/>
+      </w:r>
+      <w:r>
+        <w:rPr>
+          <w:rFonts w:ascii="Courier New" w:cs="Courier New" w:eastAsia="Courier New" w:hAnsi="Courier New"/>
+          <w:sz w:val="16"/>
+          <w:szCs w:val="16"/>
+        </w:rPr>
+        <w:t xml:space="preserve">Access-Control-Allow-Origin: *</w:t>
+      </w:r>
+    </w:p>
+    <w:p>
+      <w:pPr>
+        <w:pStyle w:val="Heading2"/>
+        <w:spacing w:after="120" w:before="240" w:line="276"/>
+      </w:pPr>
+      <w:r>
+        <w:rPr>
+          <w:rFonts w:ascii="Arial" w:cs="Arial" w:eastAsia="Arial" w:hAnsi="Arial"/>
+          <w:b/>
+          <w:bCs/>
+          <w:color w:val="1B2733"/>
+          <w:sz w:val="24"/>
+          <w:szCs w:val="24"/>
+        </w:rPr>
+        <w:t xml:space="preserve">INDICADOR 4 - Eliminar Id inexistente (404)</w:t>
+      </w:r>
+    </w:p>
+    <w:p>
+      <w:pPr>
+        <w:pBdr>
+          <w:top w:val="single" w:color="DDE3EC" w:sz="4"/>
+          <w:bottom w:val="single" w:color="DDE3EC" w:sz="4"/>
+          <w:left w:val="single" w:color="DDE3EC" w:sz="4"/>
+          <w:right w:val="single" w:color="DDE3EC" w:sz="4"/>
+        </w:pBdr>
+        <w:shd w:fill="F7F9FC" w:val="clear"/>
+        <w:spacing w:after="120" w:before="60" w:line="200"/>
+        <w:ind w:left="215" w:right="215"/>
+      </w:pPr>
+      <w:r>
+        <w:rPr>
+          <w:rFonts w:ascii="Courier New" w:cs="Courier New" w:eastAsia="Courier New" w:hAnsi="Courier New"/>
+          <w:sz w:val="16"/>
+          <w:szCs w:val="16"/>
+        </w:rPr>
+        <w:t xml:space="preserve">$ curl -i -X DELETE http://127.0.0.1:8000/api/proyectos/9999 -H "Authorization: Bearer &lt;</w:t>
+      </w:r>
+      <w:r>
+        <w:br/>
+      </w:r>
+      <w:r>
+        <w:rPr>
+          <w:rFonts w:ascii="Courier New" w:cs="Courier New" w:eastAsia="Courier New" w:hAnsi="Courier New"/>
+          <w:sz w:val="16"/>
+          <w:szCs w:val="16"/>
+        </w:rPr>
+        <w:t xml:space="preserve">    TOKEN&gt;"</w:t>
+      </w:r>
+      <w:r>
+        <w:br/>
+      </w:r>
+      <w:r>
+        <w:rPr>
+          <w:rFonts w:ascii="Courier New" w:cs="Courier New" w:eastAsia="Courier New" w:hAnsi="Courier New"/>
+          <w:sz w:val="16"/>
+          <w:szCs w:val="16"/>
+        </w:rPr>
+        <w:t xml:space="preserve">HTTP/1.1 404 Not Found</w:t>
+      </w:r>
+      <w:r>
+        <w:br/>
+      </w:r>
+      <w:r>
+        <w:rPr>
+          <w:rFonts w:ascii="Courier New" w:cs="Courier New" w:eastAsia="Courier New" w:hAnsi="Courier New"/>
+          <w:sz w:val="16"/>
+          <w:szCs w:val="16"/>
+        </w:rPr>
+        <w:t xml:space="preserve">Host: 127.0.0.1:8000</w:t>
+      </w:r>
+      <w:r>
+        <w:br/>
+      </w:r>
+      <w:r>
+        <w:rPr>
+          <w:rFonts w:ascii="Courier New" w:cs="Courier New" w:eastAsia="Courier New" w:hAnsi="Courier New"/>
+          <w:sz w:val="16"/>
+          <w:szCs w:val="16"/>
+        </w:rPr>
+        <w:t xml:space="preserve">Connection: close</w:t>
+      </w:r>
+      <w:r>
+        <w:br/>
+      </w:r>
+      <w:r>
+        <w:rPr>
+          <w:rFonts w:ascii="Courier New" w:cs="Courier New" w:eastAsia="Courier New" w:hAnsi="Courier New"/>
+          <w:sz w:val="16"/>
+          <w:szCs w:val="16"/>
+        </w:rPr>
+        <w:t xml:space="preserve">X-Powered-By: PHP/8.2.12</w:t>
+      </w:r>
+      <w:r>
+        <w:br/>
+      </w:r>
+      <w:r>
+        <w:rPr>
+          <w:rFonts w:ascii="Courier New" w:cs="Courier New" w:eastAsia="Courier New" w:hAnsi="Courier New"/>
+          <w:sz w:val="16"/>
+          <w:szCs w:val="16"/>
+        </w:rPr>
+        <w:t xml:space="preserve">Cache-Control: no-cache, private</w:t>
+      </w:r>
+      <w:r>
+        <w:br/>
+      </w:r>
+      <w:r>
+        <w:rPr>
+          <w:rFonts w:ascii="Courier New" w:cs="Courier New" w:eastAsia="Courier New" w:hAnsi="Courier New"/>
+          <w:sz w:val="16"/>
+          <w:szCs w:val="16"/>
+        </w:rPr>
+        <w:t xml:space="preserve">Date: Thu, 03 Sep 2026 00:13:50 GMT</w:t>
+      </w:r>
+      <w:r>
+        <w:br/>
+      </w:r>
+      <w:r>
+        <w:rPr>
+          <w:rFonts w:ascii="Courier New" w:cs="Courier New" w:eastAsia="Courier New" w:hAnsi="Courier New"/>
+          <w:sz w:val="16"/>
+          <w:szCs w:val="16"/>
+        </w:rPr>
+        <w:t xml:space="preserve">Content-Type: application/json</w:t>
+      </w:r>
+      <w:r>
+        <w:br/>
+      </w:r>
+      <w:r>
+        <w:rPr>
+          <w:rFonts w:ascii="Courier New" w:cs="Courier New" w:eastAsia="Courier New" w:hAnsi="Courier New"/>
+          <w:sz w:val="16"/>
+          <w:szCs w:val="16"/>
+        </w:rPr>
+        <w:t xml:space="preserve">Access-Control-Allow-Origin: *</w:t>
+      </w:r>
+      <w:r>
+        <w:br/>
+      </w:r>
+      <w:r>
+        <w:rPr>
+          <w:rFonts w:ascii="Courier New" w:cs="Courier New" w:eastAsia="Courier New" w:hAnsi="Courier New"/>
+          <w:sz w:val="16"/>
+          <w:szCs w:val="16"/>
+        </w:rPr>
+        <w:t xml:space="preserve"/>
+      </w:r>
+      <w:r>
+        <w:br/>
+      </w:r>
+      <w:r>
+        <w:rPr>
+          <w:rFonts w:ascii="Courier New" w:cs="Courier New" w:eastAsia="Courier New" w:hAnsi="Courier New"/>
+          <w:sz w:val="16"/>
+          <w:szCs w:val="16"/>
+        </w:rPr>
+        <w:t xml:space="preserve">{"message":"Proyecto no encontrado.","id":"9999"}</w:t>
+      </w:r>
+    </w:p>
+    <w:p>
+      <w:pPr>
+        <w:pStyle w:val="Heading2"/>
+        <w:spacing w:after="120" w:before="240" w:line="276"/>
+      </w:pPr>
+      <w:r>
+        <w:rPr>
+          <w:rFonts w:ascii="Arial" w:cs="Arial" w:eastAsia="Arial" w:hAnsi="Arial"/>
+          <w:b/>
+          <w:bCs/>
+          <w:color w:val="1B2733"/>
+          <w:sz w:val="24"/>
+          <w:szCs w:val="24"/>
+        </w:rPr>
+        <w:t xml:space="preserve">JWT - Acceso sin token (401 Unauthorized)</w:t>
+      </w:r>
+    </w:p>
+    <w:p>
+      <w:pPr>
+        <w:pBdr>
+          <w:top w:val="single" w:color="DDE3EC" w:sz="4"/>
+          <w:bottom w:val="single" w:color="DDE3EC" w:sz="4"/>
+          <w:left w:val="single" w:color="DDE3EC" w:sz="4"/>
+          <w:right w:val="single" w:color="DDE3EC" w:sz="4"/>
+        </w:pBdr>
+        <w:shd w:fill="F7F9FC" w:val="clear"/>
+        <w:spacing w:after="120" w:before="60" w:line="200"/>
+        <w:ind w:left="215" w:right="215"/>
+      </w:pPr>
+      <w:r>
+        <w:rPr>
+          <w:rFonts w:ascii="Courier New" w:cs="Courier New" w:eastAsia="Courier New" w:hAnsi="Courier New"/>
+          <w:sz w:val="16"/>
+          <w:szCs w:val="16"/>
+        </w:rPr>
+        <w:t xml:space="preserve">$ curl -i -X GET http://127.0.0.1:8000/api/proyectos</w:t>
+      </w:r>
+      <w:r>
+        <w:br/>
+      </w:r>
+      <w:r>
+        <w:rPr>
+          <w:rFonts w:ascii="Courier New" w:cs="Courier New" w:eastAsia="Courier New" w:hAnsi="Courier New"/>
+          <w:sz w:val="16"/>
+          <w:szCs w:val="16"/>
+        </w:rPr>
+        <w:t xml:space="preserve">HTTP/1.1 401 Unauthorized</w:t>
+      </w:r>
+      <w:r>
+        <w:br/>
+      </w:r>
+      <w:r>
+        <w:rPr>
+          <w:rFonts w:ascii="Courier New" w:cs="Courier New" w:eastAsia="Courier New" w:hAnsi="Courier New"/>
+          <w:sz w:val="16"/>
+          <w:szCs w:val="16"/>
+        </w:rPr>
+        <w:t xml:space="preserve">Host: 127.0.0.1:8000</w:t>
+      </w:r>
+      <w:r>
+        <w:br/>
+      </w:r>
+      <w:r>
+        <w:rPr>
+          <w:rFonts w:ascii="Courier New" w:cs="Courier New" w:eastAsia="Courier New" w:hAnsi="Courier New"/>
+          <w:sz w:val="16"/>
+          <w:szCs w:val="16"/>
+        </w:rPr>
+        <w:t xml:space="preserve">Connection: close</w:t>
+      </w:r>
+      <w:r>
+        <w:br/>
+      </w:r>
+      <w:r>
+        <w:rPr>
+          <w:rFonts w:ascii="Courier New" w:cs="Courier New" w:eastAsia="Courier New" w:hAnsi="Courier New"/>
+          <w:sz w:val="16"/>
+          <w:szCs w:val="16"/>
+        </w:rPr>
+        <w:t xml:space="preserve">X-Powered-By: PHP/8.2.12</w:t>
+      </w:r>
+      <w:r>
+        <w:br/>
+      </w:r>
+      <w:r>
+        <w:rPr>
+          <w:rFonts w:ascii="Courier New" w:cs="Courier New" w:eastAsia="Courier New" w:hAnsi="Courier New"/>
+          <w:sz w:val="16"/>
+          <w:szCs w:val="16"/>
+        </w:rPr>
+        <w:t xml:space="preserve">Cache-Control: no-cache, private</w:t>
+      </w:r>
+      <w:r>
+        <w:br/>
+      </w:r>
+      <w:r>
+        <w:rPr>
+          <w:rFonts w:ascii="Courier New" w:cs="Courier New" w:eastAsia="Courier New" w:hAnsi="Courier New"/>
+          <w:sz w:val="16"/>
+          <w:szCs w:val="16"/>
+        </w:rPr>
+        <w:t xml:space="preserve">Date: Thu, 03 Sep 2026 00:13:50 GMT</w:t>
+      </w:r>
+      <w:r>
+        <w:br/>
+      </w:r>
+      <w:r>
+        <w:rPr>
+          <w:rFonts w:ascii="Courier New" w:cs="Courier New" w:eastAsia="Courier New" w:hAnsi="Courier New"/>
+          <w:sz w:val="16"/>
+          <w:szCs w:val="16"/>
+        </w:rPr>
+        <w:t xml:space="preserve">Content-Type: application/json</w:t>
+      </w:r>
+      <w:r>
+        <w:br/>
+      </w:r>
+      <w:r>
+        <w:rPr>
+          <w:rFonts w:ascii="Courier New" w:cs="Courier New" w:eastAsia="Courier New" w:hAnsi="Courier New"/>
+          <w:sz w:val="16"/>
+          <w:szCs w:val="16"/>
+        </w:rPr>
+        <w:t xml:space="preserve">Access-Control-Allow-Origin: *</w:t>
+      </w:r>
+      <w:r>
+        <w:br/>
+      </w:r>
+      <w:r>
+        <w:rPr>
+          <w:rFonts w:ascii="Courier New" w:cs="Courier New" w:eastAsia="Courier New" w:hAnsi="Courier New"/>
+          <w:sz w:val="16"/>
+          <w:szCs w:val="16"/>
+        </w:rPr>
+        <w:t xml:space="preserve"/>
+      </w:r>
+      <w:r>
+        <w:br/>
+      </w:r>
+      <w:r>
+        <w:rPr>
+          <w:rFonts w:ascii="Courier New" w:cs="Courier New" w:eastAsia="Courier New" w:hAnsi="Courier New"/>
+          <w:sz w:val="16"/>
+          <w:szCs w:val="16"/>
+        </w:rPr>
+        <w:t xml:space="preserve">{"code":401,"message":"No autenticado. Debe enviar un token JWT valido.","data":null}</w:t>
       </w:r>
     </w:p>
     <w:sectPr>

</xml_diff>

<commit_message>
docs: agrega las capturas de las operaciones al informe y al repositorio
</commit_message>
<xml_diff>
--- a/docs/Informe_EV_U3.docx
+++ b/docs/Informe_EV_U3.docx
@@ -5121,6 +5121,546 @@
           <w:szCs w:val="24"/>
         </w:rPr>
         <w:t xml:space="preserve">En el Anexo A se reproduce la transcripción literal de cada petición y su respuesta HTTP, incluida la línea de estado devuelta por el servidor.</w:t>
+      </w:r>
+    </w:p>
+    <w:p>
+      <w:r>
+        <w:br w:type="page"/>
+      </w:r>
+    </w:p>
+    <w:p>
+      <w:pPr>
+        <w:pStyle w:val="Heading2"/>
+        <w:spacing w:after="120" w:before="240" w:line="276"/>
+      </w:pPr>
+      <w:r>
+        <w:rPr>
+          <w:rFonts w:ascii="Arial" w:cs="Arial" w:eastAsia="Arial" w:hAnsi="Arial"/>
+          <w:b/>
+          <w:bCs/>
+          <w:color w:val="1B2733"/>
+          <w:sz w:val="24"/>
+          <w:szCs w:val="24"/>
+        </w:rPr>
+        <w:t xml:space="preserve">5.1 Capturas de las operaciones</w:t>
+      </w:r>
+    </w:p>
+    <w:p>
+      <w:pPr>
+        <w:spacing w:after="120" w:line="276"/>
+        <w:jc w:val="both"/>
+      </w:pPr>
+      <w:r>
+        <w:rPr>
+          <w:rFonts w:ascii="Arial" w:cs="Arial" w:eastAsia="Arial" w:hAnsi="Arial"/>
+          <w:sz w:val="24"/>
+          <w:szCs w:val="24"/>
+        </w:rPr>
+        <w:t xml:space="preserve">Las siguientes capturas fueron obtenidas desde el panel de pruebas de la aplicacion, que muestra en pantalla el codigo de respuesta HTTP devuelto por el servidor en cada operacion.</w:t>
+      </w:r>
+    </w:p>
+    <w:p>
+      <w:pPr>
+        <w:spacing w:after="60" w:before="160"/>
+        <w:jc w:val="center"/>
+      </w:pPr>
+      <w:r>
+        <w:drawing>
+          <wp:inline distT="0" distB="0" distL="0" distR="0">
+            <wp:extent cx="5524500" cy="2981325"/>
+            <wp:effectExtent t="0" r="0" b="0" l="0"/>
+            <wp:docPr id="1" name="" descr="" title=""/>
+            <wp:cNvGraphicFramePr>
+              <a:graphicFrameLocks xmlns:a="http://schemas.openxmlformats.org/drawingml/2006/main" noChangeAspect="1"/>
+            </wp:cNvGraphicFramePr>
+            <a:graphic xmlns:a="http://schemas.openxmlformats.org/drawingml/2006/main">
+              <a:graphicData uri="http://schemas.openxmlformats.org/drawingml/2006/picture">
+                <pic:pic xmlns:pic="http://schemas.openxmlformats.org/drawingml/2006/picture">
+                  <pic:nvPicPr>
+                    <pic:cNvPr id="0" name="" descr=""/>
+                    <pic:cNvPicPr>
+                      <a:picLocks noChangeAspect="1" noChangeArrowheads="1"/>
+                    </pic:cNvPicPr>
+                  </pic:nvPicPr>
+                  <pic:blipFill>
+                    <a:blip r:embed="rId8" cstate="none"/>
+                    <a:srcRect/>
+                    <a:stretch>
+                      <a:fillRect/>
+                    </a:stretch>
+                  </pic:blipFill>
+                  <pic:spPr bwMode="auto">
+                    <a:xfrm>
+                      <a:off x="0" y="0"/>
+                      <a:ext cx="5524500" cy="2981325"/>
+                    </a:xfrm>
+                    <a:prstGeom prst="rect">
+                      <a:avLst/>
+                    </a:prstGeom>
+                  </pic:spPr>
+                </pic:pic>
+              </a:graphicData>
+            </a:graphic>
+          </wp:inline>
+        </w:drawing>
+      </w:r>
+    </w:p>
+    <w:p>
+      <w:pPr>
+        <w:spacing w:after="200"/>
+        <w:jc w:val="center"/>
+      </w:pPr>
+      <w:r>
+        <w:rPr>
+          <w:rFonts w:ascii="Arial" w:cs="Arial" w:eastAsia="Arial" w:hAnsi="Arial"/>
+          <w:i/>
+          <w:iCs/>
+          <w:color w:val="64748B"/>
+          <w:sz w:val="18"/>
+          <w:szCs w:val="18"/>
+        </w:rPr>
+        <w:t xml:space="preserve">Figura 1: Inicio de sesion y generacion del token JWT (HTTP 200 OK).</w:t>
+      </w:r>
+    </w:p>
+    <w:p>
+      <w:pPr>
+        <w:spacing w:after="60" w:before="160"/>
+        <w:jc w:val="center"/>
+      </w:pPr>
+      <w:r>
+        <w:drawing>
+          <wp:inline distT="0" distB="0" distL="0" distR="0">
+            <wp:extent cx="5524500" cy="2981325"/>
+            <wp:effectExtent t="0" r="0" b="0" l="0"/>
+            <wp:docPr id="1" name="" descr="" title=""/>
+            <wp:cNvGraphicFramePr>
+              <a:graphicFrameLocks xmlns:a="http://schemas.openxmlformats.org/drawingml/2006/main" noChangeAspect="1"/>
+            </wp:cNvGraphicFramePr>
+            <a:graphic xmlns:a="http://schemas.openxmlformats.org/drawingml/2006/main">
+              <a:graphicData uri="http://schemas.openxmlformats.org/drawingml/2006/picture">
+                <pic:pic xmlns:pic="http://schemas.openxmlformats.org/drawingml/2006/picture">
+                  <pic:nvPicPr>
+                    <pic:cNvPr id="0" name="" descr=""/>
+                    <pic:cNvPicPr>
+                      <a:picLocks noChangeAspect="1" noChangeArrowheads="1"/>
+                    </pic:cNvPicPr>
+                  </pic:nvPicPr>
+                  <pic:blipFill>
+                    <a:blip r:embed="rId9" cstate="none"/>
+                    <a:srcRect/>
+                    <a:stretch>
+                      <a:fillRect/>
+                    </a:stretch>
+                  </pic:blipFill>
+                  <pic:spPr bwMode="auto">
+                    <a:xfrm>
+                      <a:off x="0" y="0"/>
+                      <a:ext cx="5524500" cy="2981325"/>
+                    </a:xfrm>
+                    <a:prstGeom prst="rect">
+                      <a:avLst/>
+                    </a:prstGeom>
+                  </pic:spPr>
+                </pic:pic>
+              </a:graphicData>
+            </a:graphic>
+          </wp:inline>
+        </w:drawing>
+      </w:r>
+    </w:p>
+    <w:p>
+      <w:pPr>
+        <w:spacing w:after="200"/>
+        <w:jc w:val="center"/>
+      </w:pPr>
+      <w:r>
+        <w:rPr>
+          <w:rFonts w:ascii="Arial" w:cs="Arial" w:eastAsia="Arial" w:hAnsi="Arial"/>
+          <w:i/>
+          <w:iCs/>
+          <w:color w:val="64748B"/>
+          <w:sz w:val="18"/>
+          <w:szCs w:val="18"/>
+        </w:rPr>
+        <w:t xml:space="preserve">Figura 2: Creacion de un proyecto (HTTP 201 Created).</w:t>
+      </w:r>
+    </w:p>
+    <w:p>
+      <w:pPr>
+        <w:spacing w:after="60" w:before="160"/>
+        <w:jc w:val="center"/>
+      </w:pPr>
+      <w:r>
+        <w:drawing>
+          <wp:inline distT="0" distB="0" distL="0" distR="0">
+            <wp:extent cx="5524500" cy="2981325"/>
+            <wp:effectExtent t="0" r="0" b="0" l="0"/>
+            <wp:docPr id="1" name="" descr="" title=""/>
+            <wp:cNvGraphicFramePr>
+              <a:graphicFrameLocks xmlns:a="http://schemas.openxmlformats.org/drawingml/2006/main" noChangeAspect="1"/>
+            </wp:cNvGraphicFramePr>
+            <a:graphic xmlns:a="http://schemas.openxmlformats.org/drawingml/2006/main">
+              <a:graphicData uri="http://schemas.openxmlformats.org/drawingml/2006/picture">
+                <pic:pic xmlns:pic="http://schemas.openxmlformats.org/drawingml/2006/picture">
+                  <pic:nvPicPr>
+                    <pic:cNvPr id="0" name="" descr=""/>
+                    <pic:cNvPicPr>
+                      <a:picLocks noChangeAspect="1" noChangeArrowheads="1"/>
+                    </pic:cNvPicPr>
+                  </pic:nvPicPr>
+                  <pic:blipFill>
+                    <a:blip r:embed="rId10" cstate="none"/>
+                    <a:srcRect/>
+                    <a:stretch>
+                      <a:fillRect/>
+                    </a:stretch>
+                  </pic:blipFill>
+                  <pic:spPr bwMode="auto">
+                    <a:xfrm>
+                      <a:off x="0" y="0"/>
+                      <a:ext cx="5524500" cy="2981325"/>
+                    </a:xfrm>
+                    <a:prstGeom prst="rect">
+                      <a:avLst/>
+                    </a:prstGeom>
+                  </pic:spPr>
+                </pic:pic>
+              </a:graphicData>
+            </a:graphic>
+          </wp:inline>
+        </w:drawing>
+      </w:r>
+    </w:p>
+    <w:p>
+      <w:pPr>
+        <w:spacing w:after="200"/>
+        <w:jc w:val="center"/>
+      </w:pPr>
+      <w:r>
+        <w:rPr>
+          <w:rFonts w:ascii="Arial" w:cs="Arial" w:eastAsia="Arial" w:hAnsi="Arial"/>
+          <w:i/>
+          <w:iCs/>
+          <w:color w:val="64748B"/>
+          <w:sz w:val="18"/>
+          <w:szCs w:val="18"/>
+        </w:rPr>
+        <w:t xml:space="preserve">Figura 3: Validacion de campos obligatorios (HTTP 422 Unprocessable Content).</w:t>
+      </w:r>
+    </w:p>
+    <w:p>
+      <w:pPr>
+        <w:spacing w:after="60" w:before="160"/>
+        <w:jc w:val="center"/>
+      </w:pPr>
+      <w:r>
+        <w:drawing>
+          <wp:inline distT="0" distB="0" distL="0" distR="0">
+            <wp:extent cx="5524500" cy="2981325"/>
+            <wp:effectExtent t="0" r="0" b="0" l="0"/>
+            <wp:docPr id="1" name="" descr="" title=""/>
+            <wp:cNvGraphicFramePr>
+              <a:graphicFrameLocks xmlns:a="http://schemas.openxmlformats.org/drawingml/2006/main" noChangeAspect="1"/>
+            </wp:cNvGraphicFramePr>
+            <a:graphic xmlns:a="http://schemas.openxmlformats.org/drawingml/2006/main">
+              <a:graphicData uri="http://schemas.openxmlformats.org/drawingml/2006/picture">
+                <pic:pic xmlns:pic="http://schemas.openxmlformats.org/drawingml/2006/picture">
+                  <pic:nvPicPr>
+                    <pic:cNvPr id="0" name="" descr=""/>
+                    <pic:cNvPicPr>
+                      <a:picLocks noChangeAspect="1" noChangeArrowheads="1"/>
+                    </pic:cNvPicPr>
+                  </pic:nvPicPr>
+                  <pic:blipFill>
+                    <a:blip r:embed="rId11" cstate="none"/>
+                    <a:srcRect/>
+                    <a:stretch>
+                      <a:fillRect/>
+                    </a:stretch>
+                  </pic:blipFill>
+                  <pic:spPr bwMode="auto">
+                    <a:xfrm>
+                      <a:off x="0" y="0"/>
+                      <a:ext cx="5524500" cy="2981325"/>
+                    </a:xfrm>
+                    <a:prstGeom prst="rect">
+                      <a:avLst/>
+                    </a:prstGeom>
+                  </pic:spPr>
+                </pic:pic>
+              </a:graphicData>
+            </a:graphic>
+          </wp:inline>
+        </w:drawing>
+      </w:r>
+    </w:p>
+    <w:p>
+      <w:pPr>
+        <w:spacing w:after="200"/>
+        <w:jc w:val="center"/>
+      </w:pPr>
+      <w:r>
+        <w:rPr>
+          <w:rFonts w:ascii="Arial" w:cs="Arial" w:eastAsia="Arial" w:hAnsi="Arial"/>
+          <w:i/>
+          <w:iCs/>
+          <w:color w:val="64748B"/>
+          <w:sz w:val="18"/>
+          <w:szCs w:val="18"/>
+        </w:rPr>
+        <w:t xml:space="preserve">Figura 4: Listado completo de proyectos (HTTP 200 OK).</w:t>
+      </w:r>
+    </w:p>
+    <w:p>
+      <w:pPr>
+        <w:spacing w:after="60" w:before="160"/>
+        <w:jc w:val="center"/>
+      </w:pPr>
+      <w:r>
+        <w:drawing>
+          <wp:inline distT="0" distB="0" distL="0" distR="0">
+            <wp:extent cx="5524500" cy="2981325"/>
+            <wp:effectExtent t="0" r="0" b="0" l="0"/>
+            <wp:docPr id="1" name="" descr="" title=""/>
+            <wp:cNvGraphicFramePr>
+              <a:graphicFrameLocks xmlns:a="http://schemas.openxmlformats.org/drawingml/2006/main" noChangeAspect="1"/>
+            </wp:cNvGraphicFramePr>
+            <a:graphic xmlns:a="http://schemas.openxmlformats.org/drawingml/2006/main">
+              <a:graphicData uri="http://schemas.openxmlformats.org/drawingml/2006/picture">
+                <pic:pic xmlns:pic="http://schemas.openxmlformats.org/drawingml/2006/picture">
+                  <pic:nvPicPr>
+                    <pic:cNvPr id="0" name="" descr=""/>
+                    <pic:cNvPicPr>
+                      <a:picLocks noChangeAspect="1" noChangeArrowheads="1"/>
+                    </pic:cNvPicPr>
+                  </pic:nvPicPr>
+                  <pic:blipFill>
+                    <a:blip r:embed="rId12" cstate="none"/>
+                    <a:srcRect/>
+                    <a:stretch>
+                      <a:fillRect/>
+                    </a:stretch>
+                  </pic:blipFill>
+                  <pic:spPr bwMode="auto">
+                    <a:xfrm>
+                      <a:off x="0" y="0"/>
+                      <a:ext cx="5524500" cy="2981325"/>
+                    </a:xfrm>
+                    <a:prstGeom prst="rect">
+                      <a:avLst/>
+                    </a:prstGeom>
+                  </pic:spPr>
+                </pic:pic>
+              </a:graphicData>
+            </a:graphic>
+          </wp:inline>
+        </w:drawing>
+      </w:r>
+    </w:p>
+    <w:p>
+      <w:pPr>
+        <w:spacing w:after="200"/>
+        <w:jc w:val="center"/>
+      </w:pPr>
+      <w:r>
+        <w:rPr>
+          <w:rFonts w:ascii="Arial" w:cs="Arial" w:eastAsia="Arial" w:hAnsi="Arial"/>
+          <w:i/>
+          <w:iCs/>
+          <w:color w:val="64748B"/>
+          <w:sz w:val="18"/>
+          <w:szCs w:val="18"/>
+        </w:rPr>
+        <w:t xml:space="preserve">Figura 5: Consulta de un identificador inexistente (HTTP 404 Not Found).</w:t>
+      </w:r>
+    </w:p>
+    <w:p>
+      <w:pPr>
+        <w:spacing w:after="60" w:before="160"/>
+        <w:jc w:val="center"/>
+      </w:pPr>
+      <w:r>
+        <w:drawing>
+          <wp:inline distT="0" distB="0" distL="0" distR="0">
+            <wp:extent cx="5524500" cy="2981325"/>
+            <wp:effectExtent t="0" r="0" b="0" l="0"/>
+            <wp:docPr id="1" name="" descr="" title=""/>
+            <wp:cNvGraphicFramePr>
+              <a:graphicFrameLocks xmlns:a="http://schemas.openxmlformats.org/drawingml/2006/main" noChangeAspect="1"/>
+            </wp:cNvGraphicFramePr>
+            <a:graphic xmlns:a="http://schemas.openxmlformats.org/drawingml/2006/main">
+              <a:graphicData uri="http://schemas.openxmlformats.org/drawingml/2006/picture">
+                <pic:pic xmlns:pic="http://schemas.openxmlformats.org/drawingml/2006/picture">
+                  <pic:nvPicPr>
+                    <pic:cNvPr id="0" name="" descr=""/>
+                    <pic:cNvPicPr>
+                      <a:picLocks noChangeAspect="1" noChangeArrowheads="1"/>
+                    </pic:cNvPicPr>
+                  </pic:nvPicPr>
+                  <pic:blipFill>
+                    <a:blip r:embed="rId13" cstate="none"/>
+                    <a:srcRect/>
+                    <a:stretch>
+                      <a:fillRect/>
+                    </a:stretch>
+                  </pic:blipFill>
+                  <pic:spPr bwMode="auto">
+                    <a:xfrm>
+                      <a:off x="0" y="0"/>
+                      <a:ext cx="5524500" cy="2981325"/>
+                    </a:xfrm>
+                    <a:prstGeom prst="rect">
+                      <a:avLst/>
+                    </a:prstGeom>
+                  </pic:spPr>
+                </pic:pic>
+              </a:graphicData>
+            </a:graphic>
+          </wp:inline>
+        </w:drawing>
+      </w:r>
+    </w:p>
+    <w:p>
+      <w:pPr>
+        <w:spacing w:after="200"/>
+        <w:jc w:val="center"/>
+      </w:pPr>
+      <w:r>
+        <w:rPr>
+          <w:rFonts w:ascii="Arial" w:cs="Arial" w:eastAsia="Arial" w:hAnsi="Arial"/>
+          <w:i/>
+          <w:iCs/>
+          <w:color w:val="64748B"/>
+          <w:sz w:val="18"/>
+          <w:szCs w:val="18"/>
+        </w:rPr>
+        <w:t xml:space="preserve">Figura 6: Actualizacion de un proyecto (HTTP 200 OK).</w:t>
+      </w:r>
+    </w:p>
+    <w:p>
+      <w:pPr>
+        <w:spacing w:after="60" w:before="160"/>
+        <w:jc w:val="center"/>
+      </w:pPr>
+      <w:r>
+        <w:drawing>
+          <wp:inline distT="0" distB="0" distL="0" distR="0">
+            <wp:extent cx="5524500" cy="2981325"/>
+            <wp:effectExtent t="0" r="0" b="0" l="0"/>
+            <wp:docPr id="1" name="" descr="" title=""/>
+            <wp:cNvGraphicFramePr>
+              <a:graphicFrameLocks xmlns:a="http://schemas.openxmlformats.org/drawingml/2006/main" noChangeAspect="1"/>
+            </wp:cNvGraphicFramePr>
+            <a:graphic xmlns:a="http://schemas.openxmlformats.org/drawingml/2006/main">
+              <a:graphicData uri="http://schemas.openxmlformats.org/drawingml/2006/picture">
+                <pic:pic xmlns:pic="http://schemas.openxmlformats.org/drawingml/2006/picture">
+                  <pic:nvPicPr>
+                    <pic:cNvPr id="0" name="" descr=""/>
+                    <pic:cNvPicPr>
+                      <a:picLocks noChangeAspect="1" noChangeArrowheads="1"/>
+                    </pic:cNvPicPr>
+                  </pic:nvPicPr>
+                  <pic:blipFill>
+                    <a:blip r:embed="rId14" cstate="none"/>
+                    <a:srcRect/>
+                    <a:stretch>
+                      <a:fillRect/>
+                    </a:stretch>
+                  </pic:blipFill>
+                  <pic:spPr bwMode="auto">
+                    <a:xfrm>
+                      <a:off x="0" y="0"/>
+                      <a:ext cx="5524500" cy="2981325"/>
+                    </a:xfrm>
+                    <a:prstGeom prst="rect">
+                      <a:avLst/>
+                    </a:prstGeom>
+                  </pic:spPr>
+                </pic:pic>
+              </a:graphicData>
+            </a:graphic>
+          </wp:inline>
+        </w:drawing>
+      </w:r>
+    </w:p>
+    <w:p>
+      <w:pPr>
+        <w:spacing w:after="200"/>
+        <w:jc w:val="center"/>
+      </w:pPr>
+      <w:r>
+        <w:rPr>
+          <w:rFonts w:ascii="Arial" w:cs="Arial" w:eastAsia="Arial" w:hAnsi="Arial"/>
+          <w:i/>
+          <w:iCs/>
+          <w:color w:val="64748B"/>
+          <w:sz w:val="18"/>
+          <w:szCs w:val="18"/>
+        </w:rPr>
+        <w:t xml:space="preserve">Figura 7: Eliminacion de un proyecto (HTTP 204 No Content, cuerpo vacio).</w:t>
+      </w:r>
+    </w:p>
+    <w:p>
+      <w:pPr>
+        <w:spacing w:after="60" w:before="160"/>
+        <w:jc w:val="center"/>
+      </w:pPr>
+      <w:r>
+        <w:drawing>
+          <wp:inline distT="0" distB="0" distL="0" distR="0">
+            <wp:extent cx="5524500" cy="2933700"/>
+            <wp:effectExtent t="0" r="0" b="0" l="0"/>
+            <wp:docPr id="1" name="" descr="" title=""/>
+            <wp:cNvGraphicFramePr>
+              <a:graphicFrameLocks xmlns:a="http://schemas.openxmlformats.org/drawingml/2006/main" noChangeAspect="1"/>
+            </wp:cNvGraphicFramePr>
+            <a:graphic xmlns:a="http://schemas.openxmlformats.org/drawingml/2006/main">
+              <a:graphicData uri="http://schemas.openxmlformats.org/drawingml/2006/picture">
+                <pic:pic xmlns:pic="http://schemas.openxmlformats.org/drawingml/2006/picture">
+                  <pic:nvPicPr>
+                    <pic:cNvPr id="0" name="" descr=""/>
+                    <pic:cNvPicPr>
+                      <a:picLocks noChangeAspect="1" noChangeArrowheads="1"/>
+                    </pic:cNvPicPr>
+                  </pic:nvPicPr>
+                  <pic:blipFill>
+                    <a:blip r:embed="rId15" cstate="none"/>
+                    <a:srcRect/>
+                    <a:stretch>
+                      <a:fillRect/>
+                    </a:stretch>
+                  </pic:blipFill>
+                  <pic:spPr bwMode="auto">
+                    <a:xfrm>
+                      <a:off x="0" y="0"/>
+                      <a:ext cx="5524500" cy="2933700"/>
+                    </a:xfrm>
+                    <a:prstGeom prst="rect">
+                      <a:avLst/>
+                    </a:prstGeom>
+                  </pic:spPr>
+                </pic:pic>
+              </a:graphicData>
+            </a:graphic>
+          </wp:inline>
+        </w:drawing>
+      </w:r>
+    </w:p>
+    <w:p>
+      <w:pPr>
+        <w:spacing w:after="200"/>
+        <w:jc w:val="center"/>
+      </w:pPr>
+      <w:r>
+        <w:rPr>
+          <w:rFonts w:ascii="Arial" w:cs="Arial" w:eastAsia="Arial" w:hAnsi="Arial"/>
+          <w:i/>
+          <w:iCs/>
+          <w:color w:val="64748B"/>
+          <w:sz w:val="18"/>
+          <w:szCs w:val="18"/>
+        </w:rPr>
+        <w:t xml:space="preserve">Figura 8: Acceso sin token JWT (HTTP 401 Unauthorized).</w:t>
       </w:r>
     </w:p>
     <w:p>

</xml_diff>